<commit_message>
drafting docker info and user instsructions
</commit_message>
<xml_diff>
--- a/dockerinfo.docx
+++ b/dockerinfo.docx
@@ -3,7 +3,286 @@
 <w:document xmlns:wpc="http://schemas.microsoft.com/office/word/2010/wordprocessingCanvas" xmlns:cx="http://schemas.microsoft.com/office/drawing/2014/chartex" xmlns:cx1="http://schemas.microsoft.com/office/drawing/2015/9/8/chartex" xmlns:cx2="http://schemas.microsoft.com/office/drawing/2015/10/21/chartex" xmlns:cx3="http://schemas.microsoft.com/office/drawing/2016/5/9/chartex" xmlns:cx4="http://schemas.microsoft.com/office/drawing/2016/5/10/chartex" xmlns:cx5="http://schemas.microsoft.com/office/drawing/2016/5/11/chartex" xmlns:cx6="http://schemas.microsoft.com/office/drawing/2016/5/12/chartex" xmlns:cx7="http://schemas.microsoft.com/office/drawing/2016/5/13/chartex" xmlns:cx8="http://schemas.microsoft.com/office/drawing/2016/5/14/chartex" xmlns:mc="http://schemas.openxmlformats.org/markup-compatibility/2006" xmlns:aink="http://schemas.microsoft.com/office/drawing/2016/ink" xmlns:am3d="http://schemas.microsoft.com/office/drawing/2017/model3d" xmlns:o="urn:schemas-microsoft-com:office:office" xmlns:oel="http://schemas.microsoft.com/office/2019/extlst" xmlns:r="http://schemas.openxmlformats.org/officeDocument/2006/relationships" xmlns:m="http://schemas.openxmlformats.org/officeDocument/2006/math" xmlns:v="urn:schemas-microsoft-com:vml" xmlns:wp14="http://schemas.microsoft.com/office/word/2010/wordprocessingDrawing" xmlns:wp="http://schemas.openxmlformats.org/drawingml/2006/wordprocessingDrawing" xmlns:w10="urn:schemas-microsoft-com:office:word" xmlns:w="http://schemas.openxmlformats.org/wordprocessingml/2006/main" xmlns:w14="http://schemas.microsoft.com/office/word/2010/wordml" xmlns:w15="http://schemas.microsoft.com/office/word/2012/wordml" xmlns:w16cex="http://schemas.microsoft.com/office/word/2018/wordml/cex" xmlns:w16cid="http://schemas.microsoft.com/office/word/2016/wordml/cid" xmlns:w16="http://schemas.microsoft.com/office/word/2018/wordml" xmlns:w16du="http://schemas.microsoft.com/office/word/2023/wordml/word16du" xmlns:w16sdtdh="http://schemas.microsoft.com/office/word/2020/wordml/sdtdatahash" xmlns:w16sdtfl="http://schemas.microsoft.com/office/word/2024/wordml/sdtformatlock" xmlns:w16se="http://schemas.microsoft.com/office/word/2015/wordml/symex" xmlns:wpg="http://schemas.microsoft.com/office/word/2010/wordprocessingGroup" xmlns:wpi="http://schemas.microsoft.com/office/word/2010/wordprocessingInk" xmlns:wne="http://schemas.microsoft.com/office/word/2006/wordml" xmlns:wps="http://schemas.microsoft.com/office/word/2010/wordprocessingShape" mc:Ignorable="w14 w15 w16se w16cid w16 w16cex w16sdtdh w16sdtfl w16du wp14">
   <w:body>
     <w:p>
-      <w:r>
+      <w:pPr>
+        <w:rPr>
+          <w:color w:val="00B0F0"/>
+        </w:rPr>
+      </w:pPr>
+      <w:r>
+        <w:rPr>
+          <w:color w:val="00B0F0"/>
+        </w:rPr>
+        <w:t>docker images</w:t>
+      </w:r>
+    </w:p>
+    <w:p>
+      <w:r>
+        <w:t>REPOSITORY         TAG       IMAGE ID       CREATED       SIZE</w:t>
+      </w:r>
+    </w:p>
+    <w:p>
+      <w:proofErr w:type="spellStart"/>
+      <w:r>
+        <w:t>rsinglecell</w:t>
+      </w:r>
+      <w:proofErr w:type="spellEnd"/>
+      <w:r>
+        <w:t xml:space="preserve">        latest    be90caeeea6a   3 days ago    4.38GB</w:t>
+      </w:r>
+    </w:p>
+    <w:p>
+      <w:r>
+        <w:t>rocker/</w:t>
+      </w:r>
+      <w:proofErr w:type="spellStart"/>
+      <w:r>
+        <w:t>tidyverse</w:t>
+      </w:r>
+      <w:proofErr w:type="spellEnd"/>
+      <w:r>
+        <w:t xml:space="preserve">   latest    7be7a8fa85a1   2 weeks ago   3.77GB</w:t>
+      </w:r>
+    </w:p>
+    <w:p>
+      <w:r>
+        <w:t>rocker/</w:t>
+      </w:r>
+      <w:proofErr w:type="spellStart"/>
+      <w:r>
+        <w:t>rstudio</w:t>
+      </w:r>
+      <w:proofErr w:type="spellEnd"/>
+      <w:r>
+        <w:t xml:space="preserve">     latest    2aacb0da7889   2 weeks ago   3.14GB</w:t>
+      </w:r>
+    </w:p>
+    <w:p>
+      <w:pPr>
+        <w:rPr>
+          <w:color w:val="00B0F0"/>
+        </w:rPr>
+      </w:pPr>
+      <w:r>
+        <w:t>(base) rozen@DESKTOP-LDTK4IR:~/</w:t>
+      </w:r>
+      <w:proofErr w:type="spellStart"/>
+      <w:r>
+        <w:t>rsinglecell</w:t>
+      </w:r>
+      <w:proofErr w:type="spellEnd"/>
+      <w:r>
+        <w:t xml:space="preserve">$ </w:t>
+      </w:r>
+      <w:r>
+        <w:rPr>
+          <w:color w:val="00B0F0"/>
+        </w:rPr>
+        <w:t xml:space="preserve">docker tag </w:t>
+      </w:r>
+      <w:proofErr w:type="spellStart"/>
+      <w:r>
+        <w:rPr>
+          <w:color w:val="00B0F0"/>
+        </w:rPr>
+        <w:t>rsinglecell</w:t>
+      </w:r>
+      <w:proofErr w:type="spellEnd"/>
+      <w:r>
+        <w:rPr>
+          <w:color w:val="00B0F0"/>
+        </w:rPr>
+        <w:t xml:space="preserve"> </w:t>
+      </w:r>
+      <w:proofErr w:type="spellStart"/>
+      <w:r>
+        <w:rPr>
+          <w:color w:val="00B0F0"/>
+        </w:rPr>
+        <w:t>steverozen</w:t>
+      </w:r>
+      <w:proofErr w:type="spellEnd"/>
+      <w:r>
+        <w:rPr>
+          <w:color w:val="00B0F0"/>
+        </w:rPr>
+        <w:t>/</w:t>
+      </w:r>
+      <w:proofErr w:type="spellStart"/>
+      <w:r>
+        <w:rPr>
+          <w:color w:val="00B0F0"/>
+        </w:rPr>
+        <w:t>rsinglecell</w:t>
+      </w:r>
+      <w:proofErr w:type="spellEnd"/>
+    </w:p>
+    <w:p>
+      <w:r>
+        <w:t>(base) rozen@DESKTOP-LDTK4IR:~/</w:t>
+      </w:r>
+      <w:proofErr w:type="spellStart"/>
+      <w:r>
+        <w:t>rsinglecell</w:t>
+      </w:r>
+      <w:proofErr w:type="spellEnd"/>
+      <w:r>
+        <w:t xml:space="preserve">$ </w:t>
+      </w:r>
+      <w:r>
+        <w:rPr>
+          <w:color w:val="00B0F0"/>
+        </w:rPr>
+        <w:t>docker login</w:t>
+      </w:r>
+    </w:p>
+    <w:p>
+      <w:r>
+        <w:t xml:space="preserve">Authenticating with existing credentials... [Username: </w:t>
+      </w:r>
+      <w:proofErr w:type="spellStart"/>
+      <w:r>
+        <w:t>steverozen</w:t>
+      </w:r>
+      <w:proofErr w:type="spellEnd"/>
+      <w:r>
+        <w:t>]</w:t>
+      </w:r>
+    </w:p>
+    <w:p/>
+    <w:p>
+      <w:pPr>
+        <w:rPr>
+          <w:rFonts w:hint="eastAsia"/>
+        </w:rPr>
+      </w:pPr>
+      <w:proofErr w:type="spellStart"/>
+      <w:r>
+        <w:rPr>
+          <w:rFonts w:hint="eastAsia"/>
+        </w:rPr>
+        <w:t>i</w:t>
+      </w:r>
+      <w:proofErr w:type="spellEnd"/>
+      <w:r>
+        <w:rPr>
+          <w:rFonts w:hint="eastAsia"/>
+        </w:rPr>
+        <w:t xml:space="preserve"> Info </w:t>
+      </w:r>
+      <w:r>
+        <w:rPr>
+          <w:rFonts w:hint="eastAsia"/>
+        </w:rPr>
+        <w:t>→</w:t>
+      </w:r>
+      <w:r>
+        <w:rPr>
+          <w:rFonts w:hint="eastAsia"/>
+        </w:rPr>
+        <w:t xml:space="preserve"> To login with a different account, run 'docker logout' followed by 'docker login'</w:t>
+      </w:r>
+    </w:p>
+    <w:p/>
+    <w:p/>
+    <w:p>
+      <w:r>
+        <w:t>Login Succeeded</w:t>
+      </w:r>
+    </w:p>
+    <w:p>
+      <w:pPr>
+        <w:rPr>
+          <w:color w:val="00B0F0"/>
+        </w:rPr>
+      </w:pPr>
+      <w:r>
+        <w:rPr>
+          <w:color w:val="00B0F0"/>
+        </w:rPr>
+        <w:t xml:space="preserve">docker push </w:t>
+      </w:r>
+      <w:proofErr w:type="spellStart"/>
+      <w:r>
+        <w:rPr>
+          <w:color w:val="00B0F0"/>
+        </w:rPr>
+        <w:t>steverozen</w:t>
+      </w:r>
+      <w:proofErr w:type="spellEnd"/>
+      <w:r>
+        <w:rPr>
+          <w:color w:val="00B0F0"/>
+        </w:rPr>
+        <w:t>/</w:t>
+      </w:r>
+      <w:proofErr w:type="spellStart"/>
+      <w:r>
+        <w:rPr>
+          <w:color w:val="00B0F0"/>
+        </w:rPr>
+        <w:t>rsinglecell</w:t>
+      </w:r>
+      <w:proofErr w:type="spellEnd"/>
+    </w:p>
+    <w:p/>
+    <w:p/>
+    <w:p>
+      <w:pPr>
+        <w:rPr>
+          <w:color w:val="00B0F0"/>
+        </w:rPr>
+      </w:pPr>
+      <w:r>
+        <w:rPr>
+          <w:color w:val="00B0F0"/>
+        </w:rPr>
+        <w:t>docker run  -e PASSWORD=xx -p 8787:8787  -v /</w:t>
+      </w:r>
+      <w:proofErr w:type="spellStart"/>
+      <w:r>
+        <w:rPr>
+          <w:color w:val="00B0F0"/>
+        </w:rPr>
+        <w:t>mnt</w:t>
+      </w:r>
+      <w:proofErr w:type="spellEnd"/>
+      <w:r>
+        <w:rPr>
+          <w:color w:val="00B0F0"/>
+        </w:rPr>
+        <w:t>/d/github2/single-cell-2025:/home/</w:t>
+      </w:r>
+      <w:proofErr w:type="spellStart"/>
+      <w:r>
+        <w:rPr>
+          <w:color w:val="00B0F0"/>
+        </w:rPr>
+        <w:t>rstudio</w:t>
+      </w:r>
+      <w:proofErr w:type="spellEnd"/>
+      <w:r>
+        <w:rPr>
+          <w:color w:val="00B0F0"/>
+        </w:rPr>
+        <w:t xml:space="preserve">/repo  </w:t>
+      </w:r>
+      <w:proofErr w:type="spellStart"/>
+      <w:r>
+        <w:rPr>
+          <w:color w:val="00B0F0"/>
+        </w:rPr>
+        <w:t>rsinglecell</w:t>
+      </w:r>
+      <w:proofErr w:type="spellEnd"/>
+    </w:p>
+    <w:p/>
+    <w:p/>
+    <w:p/>
+    <w:p>
+      <w:r>
+        <w:rPr>
+          <w:highlight w:val="yellow"/>
+        </w:rPr>
         <w:t>When using RStudio in a Docker container, there are several ways to connect it to storage outside the container. Here are the main methods:</w:t>
       </w:r>
     </w:p>
@@ -213,6 +492,7 @@
     </w:p>
     <w:p>
       <w:r>
+        <w:lastRenderedPageBreak/>
         <w:t xml:space="preserve">  -v "$(</w:t>
       </w:r>
       <w:proofErr w:type="spellStart"/>
@@ -428,7 +708,6 @@
         </w:numPr>
       </w:pPr>
       <w:r>
-        <w:lastRenderedPageBreak/>
         <w:t>In Docker Desktop with WSL 2, the image files are physically stored within the WSL 2 virtual disk (ext4.vhdx file) that Docker Desktop uses</w:t>
       </w:r>
     </w:p>
@@ -620,7 +899,13 @@
     <w:p/>
     <w:p>
       <w:r>
-        <w:t>Yes, Docker images created on Windows can run on a Mac. This is one of the key benefits of Docker's "build once, run anywhere" philosophy.</w:t>
+        <w:rPr>
+          <w:highlight w:val="yellow"/>
+        </w:rPr>
+        <w:t>Yes, Docker images created on Windows can run on a Mac.</w:t>
+      </w:r>
+      <w:r>
+        <w:t xml:space="preserve"> This is one of the key benefits of Docker's "build once, run anywhere" philosophy.</w:t>
       </w:r>
     </w:p>
     <w:p>
@@ -684,6 +969,7 @@
           <w:b/>
           <w:bCs/>
         </w:rPr>
+        <w:lastRenderedPageBreak/>
         <w:t>Container platform compatibility</w:t>
       </w:r>
       <w:r>
@@ -761,6 +1047,56 @@
     </w:sectPr>
   </w:body>
 </w:document>
+</file>
+
+<file path=word/endnotes.xml><?xml version="1.0" encoding="utf-8"?>
+<w:endnotes xmlns:wpc="http://schemas.microsoft.com/office/word/2010/wordprocessingCanvas" xmlns:cx="http://schemas.microsoft.com/office/drawing/2014/chartex" xmlns:cx1="http://schemas.microsoft.com/office/drawing/2015/9/8/chartex" xmlns:cx2="http://schemas.microsoft.com/office/drawing/2015/10/21/chartex" xmlns:cx3="http://schemas.microsoft.com/office/drawing/2016/5/9/chartex" xmlns:cx4="http://schemas.microsoft.com/office/drawing/2016/5/10/chartex" xmlns:cx5="http://schemas.microsoft.com/office/drawing/2016/5/11/chartex" xmlns:cx6="http://schemas.microsoft.com/office/drawing/2016/5/12/chartex" xmlns:cx7="http://schemas.microsoft.com/office/drawing/2016/5/13/chartex" xmlns:cx8="http://schemas.microsoft.com/office/drawing/2016/5/14/chartex" xmlns:mc="http://schemas.openxmlformats.org/markup-compatibility/2006" xmlns:aink="http://schemas.microsoft.com/office/drawing/2016/ink" xmlns:am3d="http://schemas.microsoft.com/office/drawing/2017/model3d" xmlns:o="urn:schemas-microsoft-com:office:office" xmlns:oel="http://schemas.microsoft.com/office/2019/extlst" xmlns:r="http://schemas.openxmlformats.org/officeDocument/2006/relationships" xmlns:m="http://schemas.openxmlformats.org/officeDocument/2006/math" xmlns:v="urn:schemas-microsoft-com:vml" xmlns:wp14="http://schemas.microsoft.com/office/word/2010/wordprocessingDrawing" xmlns:wp="http://schemas.openxmlformats.org/drawingml/2006/wordprocessingDrawing" xmlns:w10="urn:schemas-microsoft-com:office:word" xmlns:w="http://schemas.openxmlformats.org/wordprocessingml/2006/main" xmlns:w14="http://schemas.microsoft.com/office/word/2010/wordml" xmlns:w15="http://schemas.microsoft.com/office/word/2012/wordml" xmlns:w16cex="http://schemas.microsoft.com/office/word/2018/wordml/cex" xmlns:w16cid="http://schemas.microsoft.com/office/word/2016/wordml/cid" xmlns:w16="http://schemas.microsoft.com/office/word/2018/wordml" xmlns:w16du="http://schemas.microsoft.com/office/word/2023/wordml/word16du" xmlns:w16sdtdh="http://schemas.microsoft.com/office/word/2020/wordml/sdtdatahash" xmlns:w16sdtfl="http://schemas.microsoft.com/office/word/2024/wordml/sdtformatlock" xmlns:w16se="http://schemas.microsoft.com/office/word/2015/wordml/symex" xmlns:wpg="http://schemas.microsoft.com/office/word/2010/wordprocessingGroup" xmlns:wpi="http://schemas.microsoft.com/office/word/2010/wordprocessingInk" xmlns:wne="http://schemas.microsoft.com/office/word/2006/wordml" xmlns:wps="http://schemas.microsoft.com/office/word/2010/wordprocessingShape" mc:Ignorable="w14 w15 w16se w16cid w16 w16cex w16sdtdh w16sdtfl w16du wp14">
+  <w:endnote w:type="separator" w:id="-1">
+    <w:p>
+      <w:pPr>
+        <w:spacing w:line="240" w:lineRule="auto"/>
+      </w:pPr>
+      <w:r>
+        <w:separator/>
+      </w:r>
+    </w:p>
+  </w:endnote>
+  <w:endnote w:type="continuationSeparator" w:id="0">
+    <w:p>
+      <w:pPr>
+        <w:spacing w:line="240" w:lineRule="auto"/>
+      </w:pPr>
+      <w:r>
+        <w:continuationSeparator/>
+      </w:r>
+    </w:p>
+  </w:endnote>
+</w:endnotes>
+</file>
+
+<file path=word/footnotes.xml><?xml version="1.0" encoding="utf-8"?>
+<w:footnotes xmlns:wpc="http://schemas.microsoft.com/office/word/2010/wordprocessingCanvas" xmlns:cx="http://schemas.microsoft.com/office/drawing/2014/chartex" xmlns:cx1="http://schemas.microsoft.com/office/drawing/2015/9/8/chartex" xmlns:cx2="http://schemas.microsoft.com/office/drawing/2015/10/21/chartex" xmlns:cx3="http://schemas.microsoft.com/office/drawing/2016/5/9/chartex" xmlns:cx4="http://schemas.microsoft.com/office/drawing/2016/5/10/chartex" xmlns:cx5="http://schemas.microsoft.com/office/drawing/2016/5/11/chartex" xmlns:cx6="http://schemas.microsoft.com/office/drawing/2016/5/12/chartex" xmlns:cx7="http://schemas.microsoft.com/office/drawing/2016/5/13/chartex" xmlns:cx8="http://schemas.microsoft.com/office/drawing/2016/5/14/chartex" xmlns:mc="http://schemas.openxmlformats.org/markup-compatibility/2006" xmlns:aink="http://schemas.microsoft.com/office/drawing/2016/ink" xmlns:am3d="http://schemas.microsoft.com/office/drawing/2017/model3d" xmlns:o="urn:schemas-microsoft-com:office:office" xmlns:oel="http://schemas.microsoft.com/office/2019/extlst" xmlns:r="http://schemas.openxmlformats.org/officeDocument/2006/relationships" xmlns:m="http://schemas.openxmlformats.org/officeDocument/2006/math" xmlns:v="urn:schemas-microsoft-com:vml" xmlns:wp14="http://schemas.microsoft.com/office/word/2010/wordprocessingDrawing" xmlns:wp="http://schemas.openxmlformats.org/drawingml/2006/wordprocessingDrawing" xmlns:w10="urn:schemas-microsoft-com:office:word" xmlns:w="http://schemas.openxmlformats.org/wordprocessingml/2006/main" xmlns:w14="http://schemas.microsoft.com/office/word/2010/wordml" xmlns:w15="http://schemas.microsoft.com/office/word/2012/wordml" xmlns:w16cex="http://schemas.microsoft.com/office/word/2018/wordml/cex" xmlns:w16cid="http://schemas.microsoft.com/office/word/2016/wordml/cid" xmlns:w16="http://schemas.microsoft.com/office/word/2018/wordml" xmlns:w16du="http://schemas.microsoft.com/office/word/2023/wordml/word16du" xmlns:w16sdtdh="http://schemas.microsoft.com/office/word/2020/wordml/sdtdatahash" xmlns:w16sdtfl="http://schemas.microsoft.com/office/word/2024/wordml/sdtformatlock" xmlns:w16se="http://schemas.microsoft.com/office/word/2015/wordml/symex" xmlns:wpg="http://schemas.microsoft.com/office/word/2010/wordprocessingGroup" xmlns:wpi="http://schemas.microsoft.com/office/word/2010/wordprocessingInk" xmlns:wne="http://schemas.microsoft.com/office/word/2006/wordml" xmlns:wps="http://schemas.microsoft.com/office/word/2010/wordprocessingShape" mc:Ignorable="w14 w15 w16se w16cid w16 w16cex w16sdtdh w16sdtfl w16du wp14">
+  <w:footnote w:type="separator" w:id="-1">
+    <w:p>
+      <w:pPr>
+        <w:spacing w:line="240" w:lineRule="auto"/>
+      </w:pPr>
+      <w:r>
+        <w:separator/>
+      </w:r>
+    </w:p>
+  </w:footnote>
+  <w:footnote w:type="continuationSeparator" w:id="0">
+    <w:p>
+      <w:pPr>
+        <w:spacing w:line="240" w:lineRule="auto"/>
+      </w:pPr>
+      <w:r>
+        <w:continuationSeparator/>
+      </w:r>
+    </w:p>
+  </w:footnote>
+</w:footnotes>
 </file>
 
 <file path=word/numbering.xml><?xml version="1.0" encoding="utf-8"?>
@@ -1994,6 +2330,7 @@
   <w:style w:type="character" w:default="1" w:styleId="DefaultParagraphFont">
     <w:name w:val="Default Paragraph Font"/>
     <w:uiPriority w:val="1"/>
+    <w:semiHidden/>
     <w:unhideWhenUsed/>
   </w:style>
   <w:style w:type="table" w:default="1" w:styleId="TableNormal">
@@ -2308,6 +2645,50 @@
       <w:color w:val="0F4761" w:themeColor="accent1" w:themeShade="BF"/>
       <w:spacing w:val="5"/>
     </w:rPr>
+  </w:style>
+  <w:style w:type="paragraph" w:styleId="Header">
+    <w:name w:val="header"/>
+    <w:basedOn w:val="Normal"/>
+    <w:link w:val="HeaderChar"/>
+    <w:uiPriority w:val="99"/>
+    <w:unhideWhenUsed/>
+    <w:rsid w:val="00530F1F"/>
+    <w:pPr>
+      <w:tabs>
+        <w:tab w:val="center" w:pos="4680"/>
+        <w:tab w:val="right" w:pos="9360"/>
+      </w:tabs>
+      <w:spacing w:line="240" w:lineRule="auto"/>
+    </w:pPr>
+  </w:style>
+  <w:style w:type="character" w:customStyle="1" w:styleId="HeaderChar">
+    <w:name w:val="Header Char"/>
+    <w:basedOn w:val="DefaultParagraphFont"/>
+    <w:link w:val="Header"/>
+    <w:uiPriority w:val="99"/>
+    <w:rsid w:val="00530F1F"/>
+  </w:style>
+  <w:style w:type="paragraph" w:styleId="Footer">
+    <w:name w:val="footer"/>
+    <w:basedOn w:val="Normal"/>
+    <w:link w:val="FooterChar"/>
+    <w:uiPriority w:val="99"/>
+    <w:unhideWhenUsed/>
+    <w:rsid w:val="00530F1F"/>
+    <w:pPr>
+      <w:tabs>
+        <w:tab w:val="center" w:pos="4680"/>
+        <w:tab w:val="right" w:pos="9360"/>
+      </w:tabs>
+      <w:spacing w:line="240" w:lineRule="auto"/>
+    </w:pPr>
+  </w:style>
+  <w:style w:type="character" w:customStyle="1" w:styleId="FooterChar">
+    <w:name w:val="Footer Char"/>
+    <w:basedOn w:val="DefaultParagraphFont"/>
+    <w:link w:val="Footer"/>
+    <w:uiPriority w:val="99"/>
+    <w:rsid w:val="00530F1F"/>
   </w:style>
 </w:styles>
 </file>

</xml_diff>